<commit_message>
feat: ajouter des sections pour les photos avant/après dans le document de réorganisation du kiosque IT
</commit_message>
<xml_diff>
--- a/documents/activite/reorganisation-kiosque-IT.docx
+++ b/documents/activite/reorganisation-kiosque-IT.docx
@@ -68,18 +68,18 @@
           <w:noProof/>
         </w:rPr>
         <w:drawing>
-          <wp:anchor distT="0" distB="0" distL="114300" distR="114300" simplePos="0" relativeHeight="251660288" behindDoc="1" locked="0" layoutInCell="1" allowOverlap="1" wp14:anchorId="67ACAC77" wp14:editId="1F80C291">
+          <wp:anchor distT="0" distB="0" distL="114300" distR="114300" simplePos="0" relativeHeight="251658240" behindDoc="1" locked="0" layoutInCell="1" allowOverlap="1" wp14:anchorId="792C1279" wp14:editId="7509B863">
             <wp:simplePos x="0" y="0"/>
-            <wp:positionH relativeFrom="column">
-              <wp:posOffset>4426861</wp:posOffset>
+            <wp:positionH relativeFrom="margin">
+              <wp:posOffset>779227</wp:posOffset>
             </wp:positionH>
             <wp:positionV relativeFrom="paragraph">
-              <wp:posOffset>2661533</wp:posOffset>
+              <wp:posOffset>6985</wp:posOffset>
             </wp:positionV>
-            <wp:extent cx="1852654" cy="3296348"/>
-            <wp:effectExtent l="0" t="0" r="0" b="0"/>
+            <wp:extent cx="1778152" cy="3156668"/>
+            <wp:effectExtent l="0" t="0" r="0" b="5715"/>
             <wp:wrapNone/>
-            <wp:docPr id="573591620" name="Image 5"/>
+            <wp:docPr id="362115766" name="Image 2"/>
             <wp:cNvGraphicFramePr>
               <a:graphicFrameLocks xmlns:a="http://schemas.openxmlformats.org/drawingml/2006/main" noChangeAspect="1"/>
             </wp:cNvGraphicFramePr>
@@ -87,7 +87,7 @@
               <a:graphicData uri="http://schemas.openxmlformats.org/drawingml/2006/picture">
                 <pic:pic xmlns:pic="http://schemas.openxmlformats.org/drawingml/2006/picture">
                   <pic:nvPicPr>
-                    <pic:cNvPr id="0" name="Picture 39"/>
+                    <pic:cNvPr id="0" name="Picture 36"/>
                     <pic:cNvPicPr>
                       <a:picLocks noChangeAspect="1" noChangeArrowheads="1"/>
                     </pic:cNvPicPr>
@@ -100,7 +100,7 @@
                         </a:ext>
                       </a:extLst>
                     </a:blip>
-                    <a:srcRect t="8945" b="8937"/>
+                    <a:srcRect t="8945" b="9121"/>
                     <a:stretch>
                       <a:fillRect/>
                     </a:stretch>
@@ -108,7 +108,7 @@
                   <pic:spPr bwMode="auto">
                     <a:xfrm>
                       <a:off x="0" y="0"/>
-                      <a:ext cx="1852654" cy="3296348"/>
+                      <a:ext cx="1778152" cy="3156668"/>
                     </a:xfrm>
                     <a:prstGeom prst="rect">
                       <a:avLst/>
@@ -140,16 +140,16 @@
           <w:noProof/>
         </w:rPr>
         <w:drawing>
-          <wp:anchor distT="0" distB="0" distL="114300" distR="114300" simplePos="0" relativeHeight="251659264" behindDoc="1" locked="0" layoutInCell="1" allowOverlap="1" wp14:anchorId="5D122B33" wp14:editId="0DE51A5D">
+          <wp:anchor distT="0" distB="0" distL="114300" distR="114300" simplePos="0" relativeHeight="251659264" behindDoc="1" locked="0" layoutInCell="1" allowOverlap="1" wp14:anchorId="5D122B33" wp14:editId="555D3D69">
             <wp:simplePos x="0" y="0"/>
             <wp:positionH relativeFrom="column">
-              <wp:posOffset>2113749</wp:posOffset>
+              <wp:posOffset>3409508</wp:posOffset>
             </wp:positionH>
             <wp:positionV relativeFrom="paragraph">
-              <wp:posOffset>73412</wp:posOffset>
+              <wp:posOffset>4445</wp:posOffset>
             </wp:positionV>
-            <wp:extent cx="2019632" cy="3589506"/>
-            <wp:effectExtent l="0" t="0" r="0" b="0"/>
+            <wp:extent cx="1796994" cy="3193813"/>
+            <wp:effectExtent l="0" t="0" r="0" b="6985"/>
             <wp:wrapNone/>
             <wp:docPr id="226842271" name="Image 4"/>
             <wp:cNvGraphicFramePr>
@@ -180,7 +180,7 @@
                   <pic:spPr bwMode="auto">
                     <a:xfrm>
                       <a:off x="0" y="0"/>
-                      <a:ext cx="2021980" cy="3593680"/>
+                      <a:ext cx="1796994" cy="3193813"/>
                     </a:xfrm>
                     <a:prstGeom prst="rect">
                       <a:avLst/>
@@ -207,23 +207,34 @@
           </wp:anchor>
         </w:drawing>
       </w:r>
+    </w:p>
+    <w:p/>
+    <w:p/>
+    <w:p/>
+    <w:p/>
+    <w:p/>
+    <w:p/>
+    <w:p/>
+    <w:p/>
+    <w:p/>
+    <w:p>
       <w:r>
         <w:rPr>
           <w:noProof/>
         </w:rPr>
         <w:drawing>
-          <wp:anchor distT="0" distB="0" distL="114300" distR="114300" simplePos="0" relativeHeight="251658240" behindDoc="1" locked="0" layoutInCell="1" allowOverlap="1" wp14:anchorId="792C1279" wp14:editId="7484480B">
+          <wp:anchor distT="0" distB="0" distL="114300" distR="114300" simplePos="0" relativeHeight="251661312" behindDoc="1" locked="0" layoutInCell="1" allowOverlap="1" wp14:anchorId="7E2D21CA" wp14:editId="70A71854">
             <wp:simplePos x="0" y="0"/>
-            <wp:positionH relativeFrom="margin">
-              <wp:align>left</wp:align>
+            <wp:positionH relativeFrom="column">
+              <wp:posOffset>3115613</wp:posOffset>
             </wp:positionH>
             <wp:positionV relativeFrom="paragraph">
-              <wp:posOffset>71174</wp:posOffset>
+              <wp:posOffset>333071</wp:posOffset>
             </wp:positionV>
-            <wp:extent cx="2011680" cy="3571239"/>
-            <wp:effectExtent l="0" t="0" r="7620" b="0"/>
+            <wp:extent cx="2981739" cy="2232602"/>
+            <wp:effectExtent l="0" t="0" r="0" b="0"/>
             <wp:wrapNone/>
-            <wp:docPr id="362115766" name="Image 2"/>
+            <wp:docPr id="2034348241" name="Image 2"/>
             <wp:cNvGraphicFramePr>
               <a:graphicFrameLocks xmlns:a="http://schemas.openxmlformats.org/drawingml/2006/main" noChangeAspect="1"/>
             </wp:cNvGraphicFramePr>
@@ -231,12 +242,12 @@
               <a:graphicData uri="http://schemas.openxmlformats.org/drawingml/2006/picture">
                 <pic:pic xmlns:pic="http://schemas.openxmlformats.org/drawingml/2006/picture">
                   <pic:nvPicPr>
-                    <pic:cNvPr id="0" name="Picture 36"/>
+                    <pic:cNvPr id="0" name="Picture 2"/>
                     <pic:cNvPicPr>
                       <a:picLocks noChangeAspect="1" noChangeArrowheads="1"/>
                     </pic:cNvPicPr>
                   </pic:nvPicPr>
-                  <pic:blipFill rotWithShape="1">
+                  <pic:blipFill>
                     <a:blip r:embed="rId6" cstate="print">
                       <a:extLst>
                         <a:ext uri="{28A0092B-C50C-407E-A947-70E740481C1C}">
@@ -244,7 +255,7 @@
                         </a:ext>
                       </a:extLst>
                     </a:blip>
-                    <a:srcRect t="8945" b="9121"/>
+                    <a:srcRect/>
                     <a:stretch>
                       <a:fillRect/>
                     </a:stretch>
@@ -252,7 +263,7 @@
                   <pic:spPr bwMode="auto">
                     <a:xfrm>
                       <a:off x="0" y="0"/>
-                      <a:ext cx="2011680" cy="3571239"/>
+                      <a:ext cx="2992548" cy="2240695"/>
                     </a:xfrm>
                     <a:prstGeom prst="rect">
                       <a:avLst/>
@@ -261,11 +272,6 @@
                     <a:ln>
                       <a:noFill/>
                     </a:ln>
-                    <a:extLst>
-                      <a:ext uri="{53640926-AAD7-44D8-BBD7-CCE9431645EC}">
-                        <a14:shadowObscured xmlns:a14="http://schemas.microsoft.com/office/drawing/2010/main"/>
-                      </a:ext>
-                    </a:extLst>
                   </pic:spPr>
                 </pic:pic>
               </a:graphicData>
@@ -278,6 +284,76 @@
             </wp14:sizeRelV>
           </wp:anchor>
         </w:drawing>
+      </w:r>
+      <w:r>
+        <w:rPr>
+          <w:noProof/>
+        </w:rPr>
+        <w:drawing>
+          <wp:anchor distT="0" distB="0" distL="114300" distR="114300" simplePos="0" relativeHeight="251660288" behindDoc="1" locked="0" layoutInCell="1" allowOverlap="1" wp14:anchorId="132E7831" wp14:editId="1951C2B3">
+            <wp:simplePos x="0" y="0"/>
+            <wp:positionH relativeFrom="margin">
+              <wp:align>left</wp:align>
+            </wp:positionH>
+            <wp:positionV relativeFrom="paragraph">
+              <wp:posOffset>317113</wp:posOffset>
+            </wp:positionV>
+            <wp:extent cx="2997529" cy="2250219"/>
+            <wp:effectExtent l="0" t="0" r="0" b="0"/>
+            <wp:wrapNone/>
+            <wp:docPr id="116027424" name="Image 1"/>
+            <wp:cNvGraphicFramePr>
+              <a:graphicFrameLocks xmlns:a="http://schemas.openxmlformats.org/drawingml/2006/main" noChangeAspect="1"/>
+            </wp:cNvGraphicFramePr>
+            <a:graphic xmlns:a="http://schemas.openxmlformats.org/drawingml/2006/main">
+              <a:graphicData uri="http://schemas.openxmlformats.org/drawingml/2006/picture">
+                <pic:pic xmlns:pic="http://schemas.openxmlformats.org/drawingml/2006/picture">
+                  <pic:nvPicPr>
+                    <pic:cNvPr id="0" name="Picture 1"/>
+                    <pic:cNvPicPr>
+                      <a:picLocks noChangeAspect="1" noChangeArrowheads="1"/>
+                    </pic:cNvPicPr>
+                  </pic:nvPicPr>
+                  <pic:blipFill>
+                    <a:blip r:embed="rId7" cstate="print">
+                      <a:extLst>
+                        <a:ext uri="{28A0092B-C50C-407E-A947-70E740481C1C}">
+                          <a14:useLocalDpi xmlns:a14="http://schemas.microsoft.com/office/drawing/2010/main" val="0"/>
+                        </a:ext>
+                      </a:extLst>
+                    </a:blip>
+                    <a:srcRect/>
+                    <a:stretch>
+                      <a:fillRect/>
+                    </a:stretch>
+                  </pic:blipFill>
+                  <pic:spPr bwMode="auto">
+                    <a:xfrm>
+                      <a:off x="0" y="0"/>
+                      <a:ext cx="2997529" cy="2250219"/>
+                    </a:xfrm>
+                    <a:prstGeom prst="rect">
+                      <a:avLst/>
+                    </a:prstGeom>
+                    <a:noFill/>
+                    <a:ln>
+                      <a:noFill/>
+                    </a:ln>
+                  </pic:spPr>
+                </pic:pic>
+              </a:graphicData>
+            </a:graphic>
+            <wp14:sizeRelH relativeFrom="margin">
+              <wp14:pctWidth>0</wp14:pctWidth>
+            </wp14:sizeRelH>
+            <wp14:sizeRelV relativeFrom="margin">
+              <wp14:pctHeight>0</wp14:pctHeight>
+            </wp14:sizeRelV>
+          </wp:anchor>
+        </w:drawing>
+      </w:r>
+      <w:r>
+        <w:t>Après :</w:t>
       </w:r>
     </w:p>
     <w:sectPr>
@@ -893,6 +969,7 @@
   <w:style w:type="character" w:default="1" w:styleId="Policepardfaut">
     <w:name w:val="Default Paragraph Font"/>
     <w:uiPriority w:val="1"/>
+    <w:semiHidden/>
     <w:unhideWhenUsed/>
   </w:style>
   <w:style w:type="table" w:default="1" w:styleId="TableauNormal">

</xml_diff>